<commit_message>
Add the calibration sections to the Word documentation
Section 4.8 in the methodology — label specification, detection, scale
and viewing angle with the acquisition guard, derivation of wound
dimensions, the measurement overlay, and exclusion of the reference label
— with the label photograph as Figure 4.1. Section 5.5 in the results:
accuracy against clinician tape, and error by viewing angle.

Inserted at their correct positions rather than appended, so the document
keeps its structure.

This is the same content as HTML §3.6 and §5.6, which is what the PDF is
rendered from. Two sources for one report is a maintenance cost: an edit
has to be made twice or they drift. Worth resolving once it is clear
which one the reader actually needs.

Co-Authored-By: Claude Opus 5 <noreply@anthropic.com>
</commit_message>
<xml_diff>
--- a/docs/DaiFootCare_Full_Documentation.docx
+++ b/docs/DaiFootCare_Full_Documentation.docx
@@ -1295,6 +1295,238 @@
     </w:p>
     <w:p>
       <w:pPr>
+        <w:pStyle w:val="Heading2"/>
+      </w:pPr>
+      <w:r>
+        <w:t>4.8  Dimensional calibration and the reference label</w:t>
+      </w:r>
+    </w:p>
+    <w:p>
+      <w:pPr/>
+      <w:r>
+        <w:t>Photographic measurement requires a metric reference within the field of view. In its absence the pipeline assumes a fixed field width, and the reported dimensions then scale with camera distance; measurements obtained this way are flagged as uncalibrated in the record and in the interface. A printed reference label was therefore introduced and is placed adjacent to the wound at acquisition.</w:t>
+      </w:r>
+    </w:p>
+    <w:p>
+      <w:pPr>
+        <w:pStyle w:val="Heading3"/>
+      </w:pPr>
+      <w:r>
+        <w:t>4.8.1  Label specification</w:t>
+      </w:r>
+    </w:p>
+    <w:p>
+      <w:pPr/>
+      <w:r>
+        <w:t>The label carries a cyan annulus of 2.0 cm outer diameter, with a 1.5 cm magenta variant provided for small wounds and confined anatomical sites. An annulus was selected because the central aperture provides the decisive discriminator against solid circular regions occurring in clinical photographs. Circular geometry was selected because the projection of a circle yields both the scale and the viewing angle from a single contour, which fiducial markers such as ArUco and QR do not; those alternatives were evaluated and not adopted, as they require decode-quality print and lighting and degrade discontinuously. Hue determines the assumed physical diameter, so the two hue bands are widely separated to ensure unambiguous classification. A printed ruler is included for clinician verification and is not used by the software, together with colour patches reserved for white-balance normalisation. The card is printed at 100% scale.</w:t>
+      </w:r>
+    </w:p>
+    <w:p>
+      <w:pPr>
+        <w:jc w:val="center"/>
+      </w:pPr>
+      <w:r>
+        <w:drawing>
+          <wp:inline xmlns:a="http://schemas.openxmlformats.org/drawingml/2006/main" xmlns:pic="http://schemas.openxmlformats.org/drawingml/2006/picture">
+            <wp:extent cx="4206240" cy="2532709"/>
+            <wp:docPr id="10" name="Picture 10"/>
+            <wp:cNvGraphicFramePr>
+              <a:graphicFrameLocks noChangeAspect="1"/>
+            </wp:cNvGraphicFramePr>
+            <a:graphic>
+              <a:graphicData uri="http://schemas.openxmlformats.org/drawingml/2006/picture">
+                <pic:pic>
+                  <pic:nvPicPr>
+                    <pic:cNvPr id="0" name="fig_calibration_label.png"/>
+                    <pic:cNvPicPr/>
+                  </pic:nvPicPr>
+                  <pic:blipFill>
+                    <a:blip r:embed="rId18"/>
+                    <a:stretch>
+                      <a:fillRect/>
+                    </a:stretch>
+                  </pic:blipFill>
+                  <pic:spPr>
+                    <a:xfrm>
+                      <a:off x="0" y="0"/>
+                      <a:ext cx="4206240" cy="2532709"/>
+                    </a:xfrm>
+                    <a:prstGeom prst="rect"/>
+                  </pic:spPr>
+                </pic:pic>
+              </a:graphicData>
+            </a:graphic>
+          </wp:inline>
+        </w:drawing>
+      </w:r>
+    </w:p>
+    <w:p>
+      <w:pPr/>
+      <w:r>
+        <w:rPr>
+          <w:i/>
+          <w:sz w:val="18"/>
+        </w:rPr>
+        <w:t>Figure 4.1  The DiaFootCare v5 reference label, photographed under clinical acquisition conditions. The cyan annulus (2.0 cm outer diameter) provides the metric reference.</w:t>
+      </w:r>
+    </w:p>
+    <w:p>
+      <w:pPr>
+        <w:pStyle w:val="Heading3"/>
+      </w:pPr>
+      <w:r>
+        <w:t>4.8.2  Detection</w:t>
+      </w:r>
+    </w:p>
+    <w:p>
+      <w:pPr/>
+      <w:r>
+        <w:t>Detection is performed on the frame downscaled to 640 px width. Candidate pixels are selected in HSV space (cyan: hue 80–115, saturation ≥ 60, value ≥ 40; magenta: hue 145–175, saturation ≥ 110, value ≥ 50), morphologically opened and closed, and grouped into connected components. Each component is characterised by its second central moments, from which the principal axis orientation is obtained as θ = ½ arctan(2σxy / (σxx − σyy)). Pixels are projected onto the principal axes and the major and minor extents taken as the projected ranges.</w:t>
+      </w:r>
+    </w:p>
+    <w:p>
+      <w:pPr/>
+      <w:r>
+        <w:t>Four acceptance tests are applied: circularity (minor/major ≥ 0.5); frame share (0.02 &lt; major / max(W, H) &lt; 0.45); central aperture (a disc of radius max(2, 0.15 × minor) at the centroid must contain no more than 23.5% ink); and fill ratio (0.12 &lt; area / π·(major/2)·(minor/2) &lt; 0.95). Surviving candidates are ranked by circularity.</w:t>
+      </w:r>
+    </w:p>
+    <w:p>
+      <w:pPr>
+        <w:pStyle w:val="Heading3"/>
+      </w:pPr>
+      <w:r>
+        <w:t>4.8.3  Scale and viewing angle</w:t>
+      </w:r>
+    </w:p>
+    <w:p>
+      <w:pPr/>
+      <w:r>
+        <w:t>The scale follows directly from the detected major extent:</w:t>
+      </w:r>
+    </w:p>
+    <w:p>
+      <w:pPr>
+        <w:jc w:val="center"/>
+      </w:pPr>
+      <w:r>
+        <w:rPr>
+          <w:i/>
+        </w:rPr>
+        <w:t>pixels per cm = majorₚₓ / dₑₘ</w:t>
+      </w:r>
+    </w:p>
+    <w:p>
+      <w:pPr/>
+      <w:r>
+        <w:t>where d is 2.0 cm or 1.5 cm according to the detected hue. This is a ratio of measured to known length and requires no camera intrinsics, focal length or per-device calibration, which permits a single reference to be used across all devices in a study.</w:t>
+      </w:r>
+    </w:p>
+    <w:p>
+      <w:pPr/>
+      <w:r>
+        <w:t>Under perspective projection a circle of diameter d inclined at angle φ maps to an ellipse with major = s·d and minor = s·d·cosφ. The major axis is therefore unforeshortened and the scale is invariant to inclination, while the inclination itself is recovered from the same measurement:</w:t>
+      </w:r>
+    </w:p>
+    <w:p>
+      <w:pPr>
+        <w:jc w:val="center"/>
+      </w:pPr>
+      <w:r>
+        <w:rPr>
+          <w:i/>
+        </w:rPr>
+        <w:t>φ = arccos(minor / major)</w:t>
+      </w:r>
+    </w:p>
+    <w:p>
+      <w:r>
+        <w:t>Because the inclination is recovered at the same time as the scale, it is available before the photograph is taken. The acquisition screen evaluates the preview stream continuously, displays the current inclination in degrees, and gates capture on it: acquisition proceeds below 30°, proceeds with a displayed warning between 30° and 40°, and is declined beyond 40°, the range in which measurement error exceeds 50% (Section 5.5). Where no reference label is detected the inclination cannot be determined and capture is permitted, since acquisition without a reference remains valid and is recorded as uncalibrated.</w:t>
+      </w:r>
+    </w:p>
+    <w:p>
+      <w:r>
+        <w:t>Post-capture assessment applies the same thresholds, so that guidance given at acquisition and the assessment recorded with the scan are consistent.</w:t>
+      </w:r>
+    </w:p>
+    <w:p>
+      <w:pPr>
+        <w:pStyle w:val="Heading3"/>
+      </w:pPr>
+      <w:r>
+        <w:t>4.8.4  Derivation of wound dimensions</w:t>
+      </w:r>
+    </w:p>
+    <w:p>
+      <w:pPr/>
+      <w:r>
+        <w:t>The segmentation mask is measured in original-image pixels using anisotropic scale factors sₓ = W_orig / w_mask and sᵧ = H_orig / h_mask. Length and width are the principal-axis extents of the mask, equivalent to a minimum-area rectangle, which avoids the over-measurement produced by an axis-aligned bounding box for wounds lying obliquely in the frame. Area is derived from the segmented pixel count rather than from the product of the two dimensions:</w:t>
+      </w:r>
+    </w:p>
+    <w:p>
+      <w:pPr>
+        <w:jc w:val="center"/>
+      </w:pPr>
+      <w:r>
+        <w:rPr>
+          <w:i/>
+        </w:rPr>
+        <w:t>L = majorₚₓ / (pixels per cm)     W = minorₚₓ / (pixels per cm)</w:t>
+      </w:r>
+    </w:p>
+    <w:p>
+      <w:pPr>
+        <w:jc w:val="center"/>
+      </w:pPr>
+      <w:r>
+        <w:rPr>
+          <w:i/>
+        </w:rPr>
+        <w:t>A = nₘₐₛₖ · sₓ · sᵧ / (pixels per cm)²</w:t>
+      </w:r>
+    </w:p>
+    <w:p>
+      <w:pPr>
+        <w:pStyle w:val="Heading3"/>
+      </w:pPr>
+      <w:r>
+        <w:t>4.8.5  Measurement overlay</w:t>
+      </w:r>
+    </w:p>
+    <w:p>
+      <w:pPr/>
+      <w:r>
+        <w:t>Each analysis renders an image recording the region that was measured: the segmentation mask, together with the detected reference annulus and its fitted ellipse. The overlay is stored with the scan, synchronised to the server, and displayed in both the application and the clinical dashboard.</w:t>
+      </w:r>
+    </w:p>
+    <w:p>
+      <w:pPr/>
+      <w:r>
+        <w:t>The overlay allows a reported dimension to be assessed rather than only read: a measurement derived from tissue and one derived from the printed reference produce numerically indistinguishable output, and the overlay separates the two without requiring the reviewer to repeat the analysis. It also preserves the segmentation as it stood at acquisition, which a later re-analysis under a different model version cannot reconstruct.</w:t>
+      </w:r>
+    </w:p>
+    <w:p>
+      <w:pPr>
+        <w:pStyle w:val="Heading3"/>
+      </w:pPr>
+      <w:r>
+        <w:rPr/>
+        <w:t>4.8.6  Exclusion of the reference label</w:t>
+      </w:r>
+    </w:p>
+    <w:p>
+      <w:pPr/>
+      <w:r>
+        <w:t>Because the reference label is deliberately within the field of view, the segmentation stage must distinguish printed material from tissue. Two independent mechanisms are used. First, Model 1 was fine-tuned on a clinical corpus of 31 distinct wounds across two hospitals, with 61 manually delineated reference outlines produced to a fixed protocol (trace the wound-bed margin; exclude callus, intact peri-wound skin and the reference label). Manual delineation was selected as the training target on measured grounds: it achieves 9.6–11.8% error against clinician tape measurement with ±5.8% test–retest agreement across repeat photographs, compared with ±15.0% for automatic masks. Training was performed on the Kaggle platform, initialised from the v1.1 weights with the encoder frozen, and the clinical corpus mixed with the original training data to preserve general performance.</w:t>
+      </w:r>
+    </w:p>
+    <w:p>
+      <w:pPr/>
+      <w:r>
+        <w:t>Second, a model-independent post-processing test is applied. Chromatic separation is not viable, as the measured ink fraction within granulation tissue spans 0.37–0.60 and overlaps the printed range; the discriminating property is the white substrate on which the label is printed. A four-pixel collar is sampled around each candidate component and classified as paper where saturation &lt; 50 and value &gt; 170 on the 0–255 scale; a component whose surround exceeds 40% paper is removed from the mask before measurement.</w:t>
+      </w:r>
+    </w:p>
+    <w:p>
+      <w:pPr>
         <w:pStyle w:val="Heading1"/>
       </w:pPr>
       <w:r>
@@ -2082,6 +2314,229 @@
     <w:p>
       <w:r>
         <w:br w:type="page"/>
+      </w:r>
+    </w:p>
+    <w:p>
+      <w:pPr>
+        <w:pStyle w:val="Heading2"/>
+      </w:pPr>
+      <w:r>
+        <w:t>5.5  Dimensional accuracy and label exclusion</w:t>
+      </w:r>
+    </w:p>
+    <w:p>
+      <w:pPr/>
+      <w:r>
+        <w:t>Dimensional accuracy was evaluated against clinician tape measurement on 31 distinct wounds acquired at two hospitals under the study protocol. The calibration stage itself contributes ±1.8–5%; the residual error is attributable to segmentation rather than to scale recovery.</w:t>
+      </w:r>
+    </w:p>
+    <w:tbl>
+      <w:tblPr>
+        <w:tblStyle w:val="TableGrid"/>
+        <w:tblW w:type="auto" w:w="0"/>
+        <w:tblLook w:firstColumn="1" w:firstRow="1" w:lastColumn="0" w:lastRow="0" w:noHBand="0" w:noVBand="1" w:val="04A0"/>
+      </w:tblPr>
+      <w:tblGrid>
+        <w:gridCol w:w="3120"/>
+        <w:gridCol w:w="3120"/>
+        <w:gridCol w:w="3120"/>
+      </w:tblGrid>
+      <w:tr>
+        <w:tc>
+          <w:tcPr>
+            <w:tcW w:type="dxa" w:w="3120"/>
+          </w:tcPr>
+          <w:p>
+            <w:r>
+              <w:rPr>
+                <w:b/>
+              </w:rPr>
+              <w:t>Metric</w:t>
+            </w:r>
+          </w:p>
+        </w:tc>
+        <w:tc>
+          <w:tcPr>
+            <w:tcW w:type="dxa" w:w="3120"/>
+          </w:tcPr>
+          <w:p>
+            <w:r>
+              <w:rPr>
+                <w:b/>
+              </w:rPr>
+              <w:t>Model 1 v1.1</w:t>
+            </w:r>
+          </w:p>
+        </w:tc>
+        <w:tc>
+          <w:tcPr>
+            <w:tcW w:type="dxa" w:w="3120"/>
+          </w:tcPr>
+          <w:p>
+            <w:r>
+              <w:rPr>
+                <w:b/>
+              </w:rPr>
+              <w:t>Model 1 v1.2 (deployed)</w:t>
+            </w:r>
+          </w:p>
+        </w:tc>
+      </w:tr>
+      <w:tr>
+        <w:tc>
+          <w:tcPr>
+            <w:tcW w:type="dxa" w:w="3120"/>
+          </w:tcPr>
+          <w:p>
+            <w:r>
+              <w:t>Reference labels segmented as wound (n = 42)</w:t>
+            </w:r>
+          </w:p>
+        </w:tc>
+        <w:tc>
+          <w:tcPr>
+            <w:tcW w:type="dxa" w:w="3120"/>
+          </w:tcPr>
+          <w:p>
+            <w:r>
+              <w:t>16</w:t>
+            </w:r>
+          </w:p>
+        </w:tc>
+        <w:tc>
+          <w:tcPr>
+            <w:tcW w:type="dxa" w:w="3120"/>
+          </w:tcPr>
+          <w:p>
+            <w:r>
+              <w:t>0</w:t>
+            </w:r>
+          </w:p>
+        </w:tc>
+      </w:tr>
+      <w:tr>
+        <w:tc>
+          <w:tcPr>
+            <w:tcW w:type="dxa" w:w="3120"/>
+          </w:tcPr>
+          <w:p>
+            <w:r>
+              <w:t>Clinical held-out Dice</w:t>
+            </w:r>
+          </w:p>
+        </w:tc>
+        <w:tc>
+          <w:tcPr>
+            <w:tcW w:type="dxa" w:w="3120"/>
+          </w:tcPr>
+          <w:p>
+            <w:r>
+              <w:t>0.803</w:t>
+            </w:r>
+          </w:p>
+        </w:tc>
+        <w:tc>
+          <w:tcPr>
+            <w:tcW w:type="dxa" w:w="3120"/>
+          </w:tcPr>
+          <w:p>
+            <w:r>
+              <w:t>0.869</w:t>
+            </w:r>
+          </w:p>
+        </w:tc>
+      </w:tr>
+      <w:tr>
+        <w:tc>
+          <w:tcPr>
+            <w:tcW w:type="dxa" w:w="3120"/>
+          </w:tcPr>
+          <w:p>
+            <w:r>
+              <w:t>FUSeg validation Dice</w:t>
+            </w:r>
+          </w:p>
+        </w:tc>
+        <w:tc>
+          <w:tcPr>
+            <w:tcW w:type="dxa" w:w="3120"/>
+          </w:tcPr>
+          <w:p>
+            <w:r>
+              <w:t>0.854</w:t>
+            </w:r>
+          </w:p>
+        </w:tc>
+        <w:tc>
+          <w:tcPr>
+            <w:tcW w:type="dxa" w:w="3120"/>
+          </w:tcPr>
+          <w:p>
+            <w:r>
+              <w:t>0.861</w:t>
+            </w:r>
+          </w:p>
+        </w:tc>
+      </w:tr>
+      <w:tr>
+        <w:tc>
+          <w:tcPr>
+            <w:tcW w:type="dxa" w:w="3120"/>
+          </w:tcPr>
+          <w:p>
+            <w:r>
+              <w:t>Mean error vs clinician tape</w:t>
+            </w:r>
+          </w:p>
+        </w:tc>
+        <w:tc>
+          <w:tcPr>
+            <w:tcW w:type="dxa" w:w="3120"/>
+          </w:tcPr>
+          <w:p>
+            <w:r>
+              <w:t>13.3%</w:t>
+            </w:r>
+          </w:p>
+        </w:tc>
+        <w:tc>
+          <w:tcPr>
+            <w:tcW w:type="dxa" w:w="3120"/>
+          </w:tcPr>
+          <w:p>
+            <w:r>
+              <w:t>12.7%</w:t>
+            </w:r>
+          </w:p>
+        </w:tc>
+      </w:tr>
+    </w:tbl>
+    <w:p>
+      <w:pPr/>
+      <w:r>
+        <w:rPr>
+          <w:i/>
+          <w:sz w:val="18"/>
+        </w:rPr>
+        <w:t>Table 5.5  Segmentation and measurement performance before and after clinical fine-tuning.</w:t>
+      </w:r>
+    </w:p>
+    <w:p>
+      <w:pPr/>
+      <w:r>
+        <w:t>The deployed model segments no reference label in the evaluation set (0 of 42). FUSeg validation Dice increased rather than decreased, indicating that the clinical improvement was not obtained at the expense of general segmentation performance. Comparative error is evaluated over the intersection of wounds measurable by both versions (n = 11), giving 13.32% for v1.1 against 12.69% for v1.2; wounds measurable only by v1.2 are reported separately and excluded from the paired mean.</w:t>
+      </w:r>
+    </w:p>
+    <w:p>
+      <w:pPr/>
+      <w:r>
+        <w:t>Viewing angle is a significant determinant of measurement error. Mean error is 18.1% at inclinations of 30° or less, 39.6% between 30° and 40°, and 55.8% beyond 40°, with a correlation of r = +0.479 between inclination and error. Acquisition guidance in the application displays the inclination in real time and declines capture beyond 40°.</w:t>
+      </w:r>
+    </w:p>
+    <w:p>
+      <w:pPr/>
+      <w:r>
+        <w:t>For context, manual delineation of the same wounds achieves 9.6–11.8% error, which indicates the practical ceiling of the present training target. The corpus of 31 wounds remains below the 30–50 wound target set for the study, and these figures should be interpreted accordingly.</w:t>
       </w:r>
     </w:p>
     <w:p>

</xml_diff>